<commit_message>
Input gate: refuse non-radiograph images (e.g. a colour photo)
The demo previously classified any image (even a cat). Add a transparent
pre-processing gate that rejects out-of-scope inputs before any model runs.

- src/preprocessing.py: is_probably_cxr() — a chest X-ray is grayscale; colour
  photos (mean channel saturation > 18) are rejected. Documented as a heuristic
  (rejects colour images; not a full "is-this-a-CXR" OOD detector).
- src/inference.py: rejection_result() (schema-valid uncertain + input_rejected
  flag + reason); robust_predict gates on it. api/main.py inherits the gate.
- app: predict() gates both engines (toy AND MedGemma); the UI shows a clear
  "⛔ Image refusée" banner instead of a bogus classification.
- Report section 2: document the input gate and its honest limit.
- New test: a colour image is refused, a real grayscale CXR is accepted (16 tests).

Co-Authored-By: Claude Opus 4.8 <noreply@anthropic.com>
</commit_message>
<xml_diff>
--- a/docs/rapport.docx
+++ b/docs/rapport.docx
@@ -209,6 +209,93 @@
       </w:r>
       <w:r>
         <w:t xml:space="preserve">: une radiographie thoracique frontale (image PNG/JPG).</w:t>
+      </w:r>
+    </w:p>
+    <w:p>
+      <w:pPr>
+        <w:pStyle w:val="Compact"/>
+        <w:numPr>
+          <w:ilvl w:val="0"/>
+          <w:numId w:val="1001"/>
+        </w:numPr>
+      </w:pPr>
+      <w:r>
+        <w:rPr>
+          <w:b/>
+          <w:bCs/>
+        </w:rPr>
+        <w:t xml:space="preserve">Garde d’entrée</w:t>
+      </w:r>
+      <w:r>
+        <w:t xml:space="preserve"> </w:t>
+      </w:r>
+      <w:r>
+        <w:t xml:space="preserve">: une image qui n’est pas plausiblement une radiographie</w:t>
+      </w:r>
+      <w:r>
+        <w:t xml:space="preserve"> </w:t>
+      </w:r>
+      <w:r>
+        <w:t xml:space="preserve">(photo en</w:t>
+      </w:r>
+      <w:r>
+        <w:t xml:space="preserve"> </w:t>
+      </w:r>
+      <w:r>
+        <w:rPr>
+          <w:b/>
+          <w:bCs/>
+        </w:rPr>
+        <w:t xml:space="preserve">couleur</w:t>
+      </w:r>
+      <w:r>
+        <w:t xml:space="preserve"> </w:t>
+      </w:r>
+      <w:r>
+        <w:t xml:space="preserve">: chat, selfie…) est</w:t>
+      </w:r>
+      <w:r>
+        <w:t xml:space="preserve"> </w:t>
+      </w:r>
+      <w:r>
+        <w:rPr>
+          <w:b/>
+          <w:bCs/>
+        </w:rPr>
+        <w:t xml:space="preserve">refusée avant toute analyse</w:t>
+      </w:r>
+      <w:r>
+        <w:t xml:space="preserve"> </w:t>
+      </w:r>
+      <w:r>
+        <w:t xml:space="preserve">(</w:t>
+      </w:r>
+      <w:r>
+        <w:rPr>
+          <w:rStyle w:val="VerbatimChar"/>
+        </w:rPr>
+        <w:t xml:space="preserve">src/preprocessing.py:is_probably_cxr</w:t>
+      </w:r>
+      <w:r>
+        <w:t xml:space="preserve">, détection de saturation). L’outil ne</w:t>
+      </w:r>
+      <w:r>
+        <w:t xml:space="preserve"> </w:t>
+      </w:r>
+      <w:r>
+        <w:t xml:space="preserve">doit pas classer une image hors périmètre. Heuristique transparente : elle</w:t>
+      </w:r>
+      <w:r>
+        <w:t xml:space="preserve"> </w:t>
+      </w:r>
+      <w:r>
+        <w:t xml:space="preserve">rejette les images couleur mais ne remplace pas un détecteur dédié « est-ce une</w:t>
+      </w:r>
+      <w:r>
+        <w:t xml:space="preserve"> </w:t>
+      </w:r>
+      <w:r>
+        <w:t xml:space="preserve">radio ? » (limite assumée).</w:t>
       </w:r>
     </w:p>
     <w:p>

</xml_diff>

<commit_message>
docs: fix stale test count (->17) and real-MedGemma latency (->~32s/~27s)
- QUICKSTART / rapport section 11: pytest count 15/14 -> 17 (tests added since).
- rapport section 6.4 + recap: MedGemma latency on REAL data was mistakenly the
  synthetic-run value (~17s); actual real-data run is ~31.5s (baseline) / ~27s
  (improved). Section 6.2 (synthetic, ~17s) is correct and unchanged.
- Speed ratio in 6.4 updated accordingly (~7000x, 4 ms vs ~30 s).
- Regenerated docs/rapport.docx and .html.

Co-Authored-By: Claude Opus 4.8 <noreply@anthropic.com>
</commit_message>
<xml_diff>
--- a/docs/rapport.docx
+++ b/docs/rapport.docx
@@ -2108,7 +2108,7 @@
               <w:pStyle w:val="Compact"/>
             </w:pPr>
             <w:r>
-              <w:t xml:space="preserve">~3 ms / ~27 s</w:t>
+              <w:t xml:space="preserve">~3 ms / ~32 s</w:t>
             </w:r>
           </w:p>
         </w:tc>
@@ -4946,7 +4946,7 @@
               <w:jc w:val="right"/>
             </w:pPr>
             <w:r>
-              <w:t xml:space="preserve">~17 s</w:t>
+              <w:t xml:space="preserve">~32 s</w:t>
             </w:r>
           </w:p>
         </w:tc>
@@ -5019,7 +5019,7 @@
               <w:jc w:val="right"/>
             </w:pPr>
             <w:r>
-              <w:t xml:space="preserve">~16 s</w:t>
+              <w:t xml:space="preserve">~27 s</w:t>
             </w:r>
           </w:p>
         </w:tc>
@@ -5181,13 +5181,13 @@
           <w:b/>
           <w:bCs/>
         </w:rPr>
-        <w:t xml:space="preserve">~4000× plus vite</w:t>
-      </w:r>
-      <w:r>
-        <w:t xml:space="preserve"> </w:t>
-      </w:r>
-      <w:r>
-        <w:t xml:space="preserve">(4 ms vs ~16 s). Le</w:t>
+        <w:t xml:space="preserve">~7000× plus vite</w:t>
+      </w:r>
+      <w:r>
+        <w:t xml:space="preserve"> </w:t>
+      </w:r>
+      <w:r>
+        <w:t xml:space="preserve">(4 ms vs ~30 s). Le</w:t>
       </w:r>
       <w:r>
         <w:t xml:space="preserve"> </w:t>
@@ -7724,7 +7724,7 @@
         <w:rPr>
           <w:rStyle w:val="CommentTok"/>
         </w:rPr>
-        <w:t xml:space="preserve"># 14 tests</w:t>
+        <w:t xml:space="preserve"># 17 tests</w:t>
       </w:r>
       <w:r>
         <w:br/>

</xml_diff>